<commit_message>
Add independent recheck; fix thousands separators in equations
- analysis/verify_independent.py recomputes every reported result with
  different methods (circle intersections, 5-point finite differences,
  a differently assembled Newton-Euler solver, generic Kennedy line
  intersections) and compares with output/results.json: 112 checks pass
- report: inside TeX maths a comma is punctuation, so 1,812.9 printed as
  "1, 812.9"; thousands separators in maths are now wrapped as {,}
- report: the G3-location sensitivity sentence now quotes the computed
  maximum (3.4 %) instead of "1-3 %"
- README: frame regeneration as producing practice sets

Co-Authored-By: Claude Opus 5.5 <noreply@anthropic.com>
Claude-Session: https://claude.ai/code/session_013vyqDA4fD6h5YTZvwQVHpo
</commit_message>
<xml_diff>
--- a/report/MIET1077_SixBar_Worked_Solution.docx
+++ b/report/MIET1077_SixBar_Worked_Solution.docx
@@ -3682,7 +3682,7 @@
         <w:t xml:space="preserve">”</w:t>
       </w:r>
       <w:r>
-        <w:t xml:space="preserve">: on the bisector of β, AB/2 = 330 mm from A. The Week 9 hand sketch instead marks G₃ at the centroid of triangle ABC, which is also Working Model’s default for a polygon. Section 6 shows this choice changes the joint forces by only 1–3 %, but confirm with your lecturer which one is intended.</w:t>
+        <w:t xml:space="preserve">: on the bisector of β, AB/2 = 330 mm from A. The Week 9 hand sketch instead marks G₃ at the centroid of triangle ABC, which is also Working Model’s default for a polygon. Section 6 shows this choice changes the joint forces and driving torque by at most 3.4 %, but confirm with your lecturer which one is intended.</w:t>
       </w:r>
     </w:p>
     <w:tbl>
@@ -3691,7 +3691,7 @@
         <w:tblW w:type="pct" w:w="5000"/>
         <w:tblLook w:firstRow="1" w:lastRow="0" w:firstColumn="0" w:lastColumn="0" w:noHBand="0" w:noVBand="0" w:val="0020"/>
         <w:jc w:val="start"/>
-        <w:tblCaption w:val="Table 3 – Mass properties (handout item 6). G₃ is placed literally as specified, “at β/2 and AB/2”: on the bisector of β, AB/2 = 330 mm from A. The Week 9 hand sketch instead marks G₃ at the centroid of triangle ABC, which is also Working Model’s default for a polygon. Section 6 shows this choice changes the joint forces by only 1–3 %, but confirm with your lecturer which one is intended."/>
+        <w:tblCaption w:val="Table 3 – Mass properties (handout item 6). G₃ is placed literally as specified, “at β/2 and AB/2”: on the bisector of β, AB/2 = 330 mm from A. The Week 9 hand sketch instead marks G₃ at the centroid of triangle ABC, which is also Working Model’s default for a polygon. Section 6 shows this choice changes the joint forces and driving torque by at most 3.4 %, but confirm with your lecturer which one is intended."/>
       </w:tblPr>
       <w:tblGrid>
         <w:gridCol w:w="1980"/>
@@ -57789,6 +57789,35 @@
           </w:p>
         </w:tc>
       </w:tr>
+      <w:tr>
+        <w:tc>
+          <w:tcPr/>
+          <w:p>
+            <w:pPr>
+              <w:pStyle w:val="Compact"/>
+              <w:jc w:val="left"/>
+            </w:pPr>
+            <w:r>
+              <w:rPr>
+                <w:rStyle w:val="VerbatimChar"/>
+              </w:rPr>
+              <w:t xml:space="preserve">analysis/verify_independent.py</w:t>
+            </w:r>
+          </w:p>
+        </w:tc>
+        <w:tc>
+          <w:tcPr/>
+          <w:p>
+            <w:pPr>
+              <w:pStyle w:val="Compact"/>
+              <w:jc w:val="left"/>
+            </w:pPr>
+            <w:r>
+              <w:t xml:space="preserve">independent recheck: recomputes every reported result with different methods (circle intersections, finite differences, a differently assembled force solver) and compares</w:t>
+            </w:r>
+          </w:p>
+        </w:tc>
+      </w:tr>
     </w:tbl>
     <w:p>
       <w:pPr>

</xml_diff>